<commit_message>
Update manuscript with verified citations, real author info, and GitHub URL
Co-Authored-By: Claude Sonnet 5 <noreply@anthropic.com>
</commit_message>
<xml_diff>
--- a/hippocampus_reward_zone_drift_preprint.docx
+++ b/hippocampus_reward_zone_drift_preprint.docx
@@ -29,7 +29,7 @@
                 <w:color w:val="5C4700"/>
                 <w:sz w:val="19"/>
               </w:rPr>
-              <w:t>NOTE TO AUTHOR (remove before submission): this draft was compiled from a full analysis pipeline with every reported statistic pulled directly from the underlying results files. Before submitting, please: (1) double-check author order, affiliations, and the corresponding-author email (filled in below, but verify the affiliation structure and add the email); (2) all citations have now been verified against PubMed/PMC/publisher records (see Reference list note for one caveat re: preprint-vs-published status); (3) add an ORCID/funding/conflict-of-interest statement per your target venue's requirements; (4) decide on a target venue (bioRxiv is the natural first step given this is a secondary analysis of an already-public dataset) and reformat citations to that venue's style if needed; (5) fill in the code-repository URL in Data and Code Availability once your GitHub repo is created.</w:t>
+              <w:t>NOTE TO AUTHOR (remove before submission): this draft was compiled from a full analysis pipeline with every reported statistic pulled directly from the underlying results files. Before submitting, please: (1) double-check author order, affiliations, and the corresponding-author email (filled in below, but verify the affiliation structure and add the email); (2) all citations have now been verified against PubMed/PMC/publisher records (see Reference list note for one caveat re: preprint-vs-published status); (3) add an ORCID/funding/conflict-of-interest statement per your target venue's requirements; (4) decide on a target venue (bioRxiv is the natural first step given this is a secondary analysis of an already-public dataset) and reformat citations to that venue's style if needed; (5) code repository is now live and linked in Data and Code Availability -- consider adding a LICENSE file to it (e.g. MIT) so others know how they may reuse the code.</w:t>
             </w:r>
           </w:p>
         </w:tc>
@@ -1990,7 +1990,7 @@
           <w:color w:val="1A1A1A"/>
           <w:sz w:val="22"/>
         </w:rPr>
-        <w:t>Raw data are publicly available from the DANDI Archive, dandiset 001775 (https://dandiarchive.org/dandiset/001775), with no registration required. Analysis code, including all rate-map, population-vector, zone-classification, and statistical modules, plus the Jupyter notebooks reproducing every figure and statistic in this manuscript, is available at [repository URL to be added].</w:t>
+        <w:t>Raw data are publicly available from the DANDI Archive, dandiset 001775 (https://dandiarchive.org/dandiset/001775), with no registration required. Analysis code, including all rate-map, population-vector, zone-classification, and statistical modules, plus the Jupyter notebooks reproducing every figure and statistic in this manuscript, is available at https://github.com/sisyyphuss/hippocampal-reward-zone-drift.</w:t>
       </w:r>
     </w:p>
     <w:p>

</xml_diff>